<commit_message>
Actualiza Guia Estudiante Fase 1 - Definicion Proyecto APT
</commit_message>
<xml_diff>
--- a/CAPSTONE/Fase_1/Evidencias_Grupales/1.5_GuiaEstudiante_Fase 1_Definicion Proyecto APT.docx
+++ b/CAPSTONE/Fase_1/Evidencias_Grupales/1.5_GuiaEstudiante_Fase 1_Definicion Proyecto APT.docx
@@ -156,6 +156,7 @@
                                 </w:rPr>
                                 <w:t xml:space="preserve">Asignatura </w:t>
                               </w:r>
+                              <w:proofErr w:type="spellStart"/>
                               <w:r>
                                 <w:rPr>
                                   <w:b/>
@@ -165,6 +166,7 @@
                                 </w:rPr>
                                 <w:t>Capstone</w:t>
                               </w:r>
+                              <w:proofErr w:type="spellEnd"/>
                             </w:p>
                           </w:txbxContent>
                         </wps:txbx>
@@ -329,6 +331,7 @@
                           </w:rPr>
                           <w:t xml:space="preserve">Asignatura </w:t>
                         </w:r>
+                        <w:proofErr w:type="spellStart"/>
                         <w:r>
                           <w:rPr>
                             <w:b/>
@@ -338,6 +341,7 @@
                           </w:rPr>
                           <w:t>Capstone</w:t>
                         </w:r>
+                        <w:proofErr w:type="spellEnd"/>
                       </w:p>
                     </w:txbxContent>
                   </v:textbox>
@@ -373,7 +377,7 @@
     </w:p>
     <w:p>
       <w:pPr>
-        <w:pStyle w:val="ListParagraph"/>
+        <w:pStyle w:val="Prrafodelista"/>
         <w:numPr>
           <w:ilvl w:val="0"/>
           <w:numId w:val="1"/>
@@ -399,7 +403,7 @@
     </w:p>
     <w:tbl>
       <w:tblPr>
-        <w:tblStyle w:val="TableGrid"/>
+        <w:tblStyle w:val="Tablaconcuadrcula"/>
         <w:tblW w:w="9498" w:type="dxa"/>
         <w:tblInd w:w="-714" w:type="dxa"/>
         <w:tblBorders>
@@ -466,7 +470,7 @@
           </w:tcPr>
           <w:p>
             <w:pPr>
-              <w:pStyle w:val="Footer"/>
+              <w:pStyle w:val="Piedepgina"/>
               <w:rPr>
                 <w:rFonts w:ascii="Calibri" w:hAnsi="Calibri"/>
                 <w:color w:val="1F3864" w:themeColor="accent1" w:themeShade="80"/>
@@ -496,7 +500,7 @@
     </w:p>
     <w:tbl>
       <w:tblPr>
-        <w:tblStyle w:val="TableGrid"/>
+        <w:tblStyle w:val="Tablaconcuadrcula"/>
         <w:tblW w:w="9498" w:type="dxa"/>
         <w:tblInd w:w="-714" w:type="dxa"/>
         <w:tblBorders>
@@ -568,12 +572,21 @@
               </w:rPr>
               <w:t>Peredo</w:t>
             </w:r>
+            <w:proofErr w:type="gramStart"/>
             <w:r>
               <w:rPr>
                 <w:rFonts w:ascii="Calibri" w:hAnsi="Calibri"/>
                 <w:sz w:val="20"/>
               </w:rPr>
-              <w:t xml:space="preserve">/  Ian </w:t>
+              <w:t>/  Ian</w:t>
+            </w:r>
+            <w:proofErr w:type="gramEnd"/>
+            <w:r>
+              <w:rPr>
+                <w:rFonts w:ascii="Calibri" w:hAnsi="Calibri"/>
+                <w:sz w:val="20"/>
+              </w:rPr>
+              <w:t xml:space="preserve"> </w:t>
             </w:r>
             <w:r>
               <w:rPr>
@@ -624,7 +637,30 @@
                 <w:rFonts w:ascii="Calibri" w:hAnsi="Calibri"/>
                 <w:sz w:val="20"/>
               </w:rPr>
-              <w:t xml:space="preserve">[RUT Kevin]  /  </w:t>
+              <w:t>20.636.322-</w:t>
+            </w:r>
+            <w:proofErr w:type="gramStart"/>
+            <w:r>
+              <w:rPr>
+                <w:rFonts w:ascii="Calibri" w:hAnsi="Calibri"/>
+                <w:sz w:val="20"/>
+              </w:rPr>
+              <w:t>3</w:t>
+            </w:r>
+            <w:r>
+              <w:rPr>
+                <w:rFonts w:ascii="Calibri" w:hAnsi="Calibri"/>
+                <w:sz w:val="20"/>
+              </w:rPr>
+              <w:t xml:space="preserve">  /</w:t>
+            </w:r>
+            <w:proofErr w:type="gramEnd"/>
+            <w:r>
+              <w:rPr>
+                <w:rFonts w:ascii="Calibri" w:hAnsi="Calibri"/>
+                <w:sz w:val="20"/>
+              </w:rPr>
+              <w:t xml:space="preserve">  </w:t>
             </w:r>
             <w:r>
               <w:rPr>
@@ -738,7 +774,7 @@
     </w:p>
     <w:tbl>
       <w:tblPr>
-        <w:tblStyle w:val="TableGrid"/>
+        <w:tblStyle w:val="Tablaconcuadrcula"/>
         <w:tblW w:w="9498" w:type="dxa"/>
         <w:tblInd w:w="-714" w:type="dxa"/>
         <w:tblBorders>
@@ -796,7 +832,7 @@
           </w:tcPr>
           <w:p>
             <w:pPr>
-              <w:pStyle w:val="Footer"/>
+              <w:pStyle w:val="Piedepgina"/>
               <w:rPr>
                 <w:rFonts w:ascii="Calibri" w:hAnsi="Calibri"/>
                 <w:color w:val="1F3864" w:themeColor="accent1" w:themeShade="80"/>
@@ -824,7 +860,7 @@
     </w:p>
     <w:tbl>
       <w:tblPr>
-        <w:tblStyle w:val="TableGrid"/>
+        <w:tblStyle w:val="Tablaconcuadrcula"/>
         <w:tblW w:w="9498" w:type="dxa"/>
         <w:tblInd w:w="-714" w:type="dxa"/>
         <w:tblBorders>
@@ -875,12 +911,21 @@
             <w:pPr>
               <w:spacing w:before="40" w:after="40"/>
             </w:pPr>
+            <w:proofErr w:type="spellStart"/>
             <w:r>
               <w:rPr>
                 <w:rFonts w:ascii="Calibri" w:hAnsi="Calibri"/>
                 <w:sz w:val="20"/>
               </w:rPr>
-              <w:t>AloApp / ALO Field App: aplicación móvil para la gestión y trazabilidad de órdenes de mantenimiento asignadas a técnicos.</w:t>
+              <w:t>AloApp</w:t>
+            </w:r>
+            <w:proofErr w:type="spellEnd"/>
+            <w:r>
+              <w:rPr>
+                <w:rFonts w:ascii="Calibri" w:hAnsi="Calibri"/>
+                <w:sz w:val="20"/>
+              </w:rPr>
+              <w:t xml:space="preserve"> / ALO Field App: aplicación móvil para la gestión y trazabilidad de órdenes de mantenimiento asignadas a técnicos.</w:t>
             </w:r>
           </w:p>
         </w:tc>
@@ -1013,7 +1058,7 @@
     </w:p>
     <w:tbl>
       <w:tblPr>
-        <w:tblStyle w:val="TableGrid"/>
+        <w:tblStyle w:val="Tablaconcuadrcula"/>
         <w:tblW w:w="9498" w:type="dxa"/>
         <w:tblInd w:w="-714" w:type="dxa"/>
         <w:tblBorders>
@@ -1081,7 +1126,7 @@
           </w:tcPr>
           <w:p>
             <w:pPr>
-              <w:pStyle w:val="Footer"/>
+              <w:pStyle w:val="Piedepgina"/>
               <w:jc w:val="both"/>
               <w:rPr>
                 <w:rFonts w:ascii="Calibri" w:hAnsi="Calibri"/>
@@ -1126,7 +1171,7 @@
     </w:p>
     <w:tbl>
       <w:tblPr>
-        <w:tblStyle w:val="TableGrid"/>
+        <w:tblStyle w:val="Tablaconcuadrcula"/>
         <w:tblW w:w="5591" w:type="pct"/>
         <w:tblInd w:w="-714" w:type="dxa"/>
         <w:tblBorders>
@@ -1177,12 +1222,21 @@
             <w:pPr>
               <w:spacing w:before="40" w:after="40"/>
             </w:pPr>
+            <w:proofErr w:type="spellStart"/>
             <w:r>
               <w:rPr>
                 <w:rFonts w:ascii="Calibri" w:hAnsi="Calibri"/>
                 <w:sz w:val="20"/>
               </w:rPr>
-              <w:t>AloApp responde a la necesidad de mejorar el control y la trazabilidad de las órdenes de mantenimiento asignadas a técnicos de Alo Group, una empresa real. Actualmente, la información necesaria para ejecutar y revisar una orden se encuentra en una base de datos que no está disponible de forma simple y directa para el técnico durante su jornada de trabajo. La problemática afecta principalmente a los técnicos responsables de ejecutar los mantenimientos, ya que requieren identificar sus tareas pendientes y consultar información actualizada de manera oportuna. También impacta indirectamente a quienes supervisan las operaciones, porque una gestión ordenada de las órdenes facilita el seguimiento de las actividades realizadas. El aporte del proyecto es una aplicación móvil que permite al técnico identificarse y visualizar únicamente las órdenes de mantenimiento que le corresponden, mejorando la organización del trabajo, la consulta de información y la trazabilidad de las operaciones. Esto es relevante para el campo laboral de la Ingeniería Informática, ya que integra análisis de una necesidad real, desarrollo de software y acceso controlado a datos.</w:t>
+              <w:t>AloApp</w:t>
+            </w:r>
+            <w:proofErr w:type="spellEnd"/>
+            <w:r>
+              <w:rPr>
+                <w:rFonts w:ascii="Calibri" w:hAnsi="Calibri"/>
+                <w:sz w:val="20"/>
+              </w:rPr>
+              <w:t xml:space="preserve"> responde a la necesidad de mejorar el control y la trazabilidad de las órdenes de mantenimiento asignadas a técnicos de Alo Group, una empresa real. Actualmente, la información necesaria para ejecutar y revisar una orden se encuentra en una base de datos que no está disponible de forma simple y directa para el técnico durante su jornada de trabajo. La problemática afecta principalmente a los técnicos responsables de ejecutar los mantenimientos, ya que requieren identificar sus tareas pendientes y consultar información actualizada de manera oportuna. También impacta indirectamente a quienes supervisan las operaciones, porque una gestión ordenada de las órdenes facilita el seguimiento de las actividades realizadas. El aporte del proyecto es una aplicación móvil que permite al técnico identificarse y visualizar únicamente las órdenes de mantenimiento que le corresponden, mejorando la organización del trabajo, la consulta de información y la trazabilidad de las operaciones. Esto es relevante para el campo laboral de la Ingeniería Informática, ya que integra análisis de una necesidad real, desarrollo de software y acceso controlado a datos.</w:t>
             </w:r>
           </w:p>
         </w:tc>
@@ -1228,12 +1282,53 @@
             <w:pPr>
               <w:spacing w:before="40" w:after="40"/>
             </w:pPr>
+            <w:proofErr w:type="spellStart"/>
             <w:r>
               <w:rPr>
                 <w:rFonts w:ascii="Calibri" w:hAnsi="Calibri"/>
                 <w:sz w:val="20"/>
               </w:rPr>
-              <w:t>AloApp es una aplicación móvil orientada a técnicos de mantenimiento. Su objetivo es permitir que cada técnico se identifique dentro de la aplicación y pueda consultar exclusivamente las órdenes de mantenimiento que tiene asignadas. La aplicación obtiene los datos desde la base de datos existente de la empresa, mediante el mecanismo de integración autorizado. El alcance principal considera: identificación o autenticación del técnico; consulta de las órdenes de mantenimiento asociadas al técnico identificado; visualización de un panel principal con la información relevante; y una gestión desacoplada de los datos para facilitar futuras mejoras e integraciones. La solución se desarrolla con Flutter y Dart para Android, utilizando una arquitectura Feature-First que separa presentación, gestión de estado, repositorio y servicios, lo que mantiene la aplicación organizada y facilita futuras ampliaciones.</w:t>
+              <w:t>AloApp</w:t>
+            </w:r>
+            <w:proofErr w:type="spellEnd"/>
+            <w:r>
+              <w:rPr>
+                <w:rFonts w:ascii="Calibri" w:hAnsi="Calibri"/>
+                <w:sz w:val="20"/>
+              </w:rPr>
+              <w:t xml:space="preserve"> es una aplicación móvil orientada a técnicos de mantenimiento. Su objetivo es permitir que cada técnico se identifique dentro de la aplicación y pueda consultar exclusivamente las órdenes de mantenimiento que tiene asignadas. La aplicación obtiene los datos desde la base de datos existente de la empresa, mediante el mecanismo de integración autorizado. El alcance principal considera: identificación o autenticación del técnico; consulta de las órdenes de mantenimiento asociadas al técnico identificado; visualización de un panel principal con la información relevante; y una gestión desacoplada de los datos para facilitar futuras mejoras e integraciones. La solución se desarrolla con </w:t>
+            </w:r>
+            <w:proofErr w:type="spellStart"/>
+            <w:r>
+              <w:rPr>
+                <w:rFonts w:ascii="Calibri" w:hAnsi="Calibri"/>
+                <w:sz w:val="20"/>
+              </w:rPr>
+              <w:t>Flutter</w:t>
+            </w:r>
+            <w:proofErr w:type="spellEnd"/>
+            <w:r>
+              <w:rPr>
+                <w:rFonts w:ascii="Calibri" w:hAnsi="Calibri"/>
+                <w:sz w:val="20"/>
+              </w:rPr>
+              <w:t xml:space="preserve"> y Dart para Android, utilizando una arquitectura </w:t>
+            </w:r>
+            <w:proofErr w:type="spellStart"/>
+            <w:r>
+              <w:rPr>
+                <w:rFonts w:ascii="Calibri" w:hAnsi="Calibri"/>
+                <w:sz w:val="20"/>
+              </w:rPr>
+              <w:t>Feature</w:t>
+            </w:r>
+            <w:proofErr w:type="spellEnd"/>
+            <w:r>
+              <w:rPr>
+                <w:rFonts w:ascii="Calibri" w:hAnsi="Calibri"/>
+                <w:sz w:val="20"/>
+              </w:rPr>
+              <w:t>-First que separa presentación, gestión de estado, repositorio y servicios, lo que mantiene la aplicación organizada y facilita futuras ampliaciones.</w:t>
             </w:r>
           </w:p>
         </w:tc>
@@ -1284,7 +1379,23 @@
                 <w:rFonts w:ascii="Calibri" w:hAnsi="Calibri"/>
                 <w:sz w:val="20"/>
               </w:rPr>
-              <w:t>El proyecto se relaciona con el perfil de egreso de Ingeniería Informática porque requiere analizar una necesidad real de una organización, diseñar una solución tecnológica, planificar su desarrollo, implementar una aplicación móvil y verificar sus funcionalidades. AloApp permite aplicar competencias de desarrollo de software mediante la construcción de una aplicación móvil; de gestión de proyectos mediante la planificación de actividades, recursos y riesgos; de pruebas mediante la verificación de la autenticación y la consulta de órdenes; y de gestión de datos mediante el consumo y la visualización de información proveniente de una base de datos existente. Estas competencias son necesarias para resolver la problemática planteada de forma ordenada y verificable.</w:t>
+              <w:t xml:space="preserve">El proyecto se relaciona con el perfil de egreso de Ingeniería Informática porque requiere analizar una necesidad real de una organización, diseñar una solución tecnológica, planificar su desarrollo, implementar una aplicación móvil y verificar sus funcionalidades. </w:t>
+            </w:r>
+            <w:proofErr w:type="spellStart"/>
+            <w:r>
+              <w:rPr>
+                <w:rFonts w:ascii="Calibri" w:hAnsi="Calibri"/>
+                <w:sz w:val="20"/>
+              </w:rPr>
+              <w:t>AloApp</w:t>
+            </w:r>
+            <w:proofErr w:type="spellEnd"/>
+            <w:r>
+              <w:rPr>
+                <w:rFonts w:ascii="Calibri" w:hAnsi="Calibri"/>
+                <w:sz w:val="20"/>
+              </w:rPr>
+              <w:t xml:space="preserve"> permite aplicar competencias de desarrollo de software mediante la construcción de una aplicación móvil; de gestión de proyectos mediante la planificación de actividades, recursos y riesgos; de pruebas mediante la verificación de la autenticación y la consulta de órdenes; y de gestión de datos mediante el consumo y la visualización de información proveniente de una base de datos existente. Estas competencias son necesarias para resolver la problemática planteada de forma ordenada y verificable.</w:t>
             </w:r>
           </w:p>
         </w:tc>
@@ -1373,7 +1484,71 @@
                 <w:rFonts w:ascii="Calibri" w:hAnsi="Calibri"/>
                 <w:sz w:val="20"/>
               </w:rPr>
-              <w:t>El proyecto es factible porque cuenta con una necesidad real, una base de datos existente y herramientas tecnológicas ya definidas. Se utilizarán Flutter, Dart, Visual Studio Code, Git, GitHub, flutter_bloc, Dio, get_it y flutter_dotenv. El desarrollo se enmarca en el semestre académico (18 semanas) y en las horas asignadas a la asignatura. El alcance se mantiene acotado a la identificación del técnico y la visualización de sus órdenes asignadas, lo que permite concentrar el trabajo en una solución funcional y comprobable. Como factor externo que facilita el desarrollo está la disponibilidad de la base de datos de la empresa y de un repositorio ya creado. Los principales factores que podrían dificultarlo son la disponibilidad de los datos, posibles restricciones de acceso a la base de datos y cambios de requerimientos; para mitigarlos, el equipo definirá oportunamente el mecanismo de consulta, validará los campos requeridos de las órdenes y trabajará con datos controlados o de prueba cuando sea necesario.</w:t>
+              <w:t xml:space="preserve">El proyecto es factible porque cuenta con una necesidad real, una base de datos existente y herramientas tecnológicas ya definidas. Se utilizarán </w:t>
+            </w:r>
+            <w:proofErr w:type="spellStart"/>
+            <w:r>
+              <w:rPr>
+                <w:rFonts w:ascii="Calibri" w:hAnsi="Calibri"/>
+                <w:sz w:val="20"/>
+              </w:rPr>
+              <w:t>Flutter</w:t>
+            </w:r>
+            <w:proofErr w:type="spellEnd"/>
+            <w:r>
+              <w:rPr>
+                <w:rFonts w:ascii="Calibri" w:hAnsi="Calibri"/>
+                <w:sz w:val="20"/>
+              </w:rPr>
+              <w:t xml:space="preserve">, Dart, Visual Studio Code, Git, GitHub, </w:t>
+            </w:r>
+            <w:proofErr w:type="spellStart"/>
+            <w:r>
+              <w:rPr>
+                <w:rFonts w:ascii="Calibri" w:hAnsi="Calibri"/>
+                <w:sz w:val="20"/>
+              </w:rPr>
+              <w:t>flutter_bloc</w:t>
+            </w:r>
+            <w:proofErr w:type="spellEnd"/>
+            <w:r>
+              <w:rPr>
+                <w:rFonts w:ascii="Calibri" w:hAnsi="Calibri"/>
+                <w:sz w:val="20"/>
+              </w:rPr>
+              <w:t xml:space="preserve">, Dio, </w:t>
+            </w:r>
+            <w:proofErr w:type="spellStart"/>
+            <w:r>
+              <w:rPr>
+                <w:rFonts w:ascii="Calibri" w:hAnsi="Calibri"/>
+                <w:sz w:val="20"/>
+              </w:rPr>
+              <w:t>get_it</w:t>
+            </w:r>
+            <w:proofErr w:type="spellEnd"/>
+            <w:r>
+              <w:rPr>
+                <w:rFonts w:ascii="Calibri" w:hAnsi="Calibri"/>
+                <w:sz w:val="20"/>
+              </w:rPr>
+              <w:t xml:space="preserve"> y </w:t>
+            </w:r>
+            <w:proofErr w:type="spellStart"/>
+            <w:r>
+              <w:rPr>
+                <w:rFonts w:ascii="Calibri" w:hAnsi="Calibri"/>
+                <w:sz w:val="20"/>
+              </w:rPr>
+              <w:t>flutter_dotenv</w:t>
+            </w:r>
+            <w:proofErr w:type="spellEnd"/>
+            <w:r>
+              <w:rPr>
+                <w:rFonts w:ascii="Calibri" w:hAnsi="Calibri"/>
+                <w:sz w:val="20"/>
+              </w:rPr>
+              <w:t>. El desarrollo se enmarca en el semestre académico (18 semanas) y en las horas asignadas a la asignatura. El alcance se mantiene acotado a la identificación del técnico y la visualización de sus órdenes asignadas, lo que permite concentrar el trabajo en una solución funcional y comprobable. Como factor externo que facilita el desarrollo está la disponibilidad de la base de datos de la empresa y de un repositorio ya creado. Los principales factores que podrían dificultarlo son la disponibilidad de los datos, posibles restricciones de acceso a la base de datos y cambios de requerimientos; para mitigarlos, el equipo definirá oportunamente el mecanismo de consulta, validará los campos requeridos de las órdenes y trabajará con datos controlados o de prueba cuando sea necesario.</w:t>
             </w:r>
           </w:p>
         </w:tc>
@@ -1392,7 +1567,7 @@
     </w:p>
     <w:p>
       <w:pPr>
-        <w:pStyle w:val="ListParagraph"/>
+        <w:pStyle w:val="Prrafodelista"/>
         <w:numPr>
           <w:ilvl w:val="0"/>
           <w:numId w:val="1"/>
@@ -1418,7 +1593,7 @@
     </w:p>
     <w:tbl>
       <w:tblPr>
-        <w:tblStyle w:val="TableGrid"/>
+        <w:tblStyle w:val="Tablaconcuadrcula"/>
         <w:tblW w:w="9498" w:type="dxa"/>
         <w:tblInd w:w="-714" w:type="dxa"/>
         <w:tblBorders>
@@ -1494,7 +1669,7 @@
           </w:tcPr>
           <w:p>
             <w:pPr>
-              <w:pStyle w:val="Footer"/>
+              <w:pStyle w:val="Piedepgina"/>
               <w:jc w:val="both"/>
               <w:rPr>
                 <w:rFonts w:ascii="Calibri" w:hAnsi="Calibri"/>
@@ -1525,7 +1700,7 @@
     </w:p>
     <w:tbl>
       <w:tblPr>
-        <w:tblStyle w:val="TableGrid"/>
+        <w:tblStyle w:val="Tablaconcuadrcula"/>
         <w:tblW w:w="9498" w:type="dxa"/>
         <w:tblInd w:w="-714" w:type="dxa"/>
         <w:tblBorders>
@@ -1658,7 +1833,23 @@
                 <w:rFonts w:ascii="Calibri" w:hAnsi="Calibri"/>
                 <w:sz w:val="20"/>
               </w:rPr>
-              <w:t>2. Definir los requerimientos funcionales y no funcionales de AloApp.</w:t>
+              <w:t xml:space="preserve">2. Definir los requerimientos funcionales y no funcionales de </w:t>
+            </w:r>
+            <w:proofErr w:type="spellStart"/>
+            <w:r>
+              <w:rPr>
+                <w:rFonts w:ascii="Calibri" w:hAnsi="Calibri"/>
+                <w:sz w:val="20"/>
+              </w:rPr>
+              <w:t>AloApp</w:t>
+            </w:r>
+            <w:proofErr w:type="spellEnd"/>
+            <w:r>
+              <w:rPr>
+                <w:rFonts w:ascii="Calibri" w:hAnsi="Calibri"/>
+                <w:sz w:val="20"/>
+              </w:rPr>
+              <w:t>.</w:t>
             </w:r>
           </w:p>
           <w:p>
@@ -1748,7 +1939,7 @@
     </w:p>
     <w:tbl>
       <w:tblPr>
-        <w:tblStyle w:val="TableGrid"/>
+        <w:tblStyle w:val="Tablaconcuadrcula"/>
         <w:tblW w:w="9498" w:type="dxa"/>
         <w:tblInd w:w="-714" w:type="dxa"/>
         <w:tblBorders>
@@ -1824,7 +2015,7 @@
           </w:tcPr>
           <w:p>
             <w:pPr>
-              <w:pStyle w:val="Footer"/>
+              <w:pStyle w:val="Piedepgina"/>
               <w:jc w:val="both"/>
               <w:rPr>
                 <w:rFonts w:ascii="Calibri" w:hAnsi="Calibri"/>
@@ -1876,7 +2067,7 @@
     </w:p>
     <w:tbl>
       <w:tblPr>
-        <w:tblStyle w:val="TableGrid"/>
+        <w:tblStyle w:val="Tablaconcuadrcula"/>
         <w:tblW w:w="9498" w:type="dxa"/>
         <w:tblInd w:w="-714" w:type="dxa"/>
         <w:tblBorders>
@@ -2097,7 +2288,7 @@
     </w:p>
     <w:tbl>
       <w:tblPr>
-        <w:tblStyle w:val="TableGrid"/>
+        <w:tblStyle w:val="Tablaconcuadrcula"/>
         <w:tblW w:w="9640" w:type="dxa"/>
         <w:tblInd w:w="-714" w:type="dxa"/>
         <w:tblBorders>
@@ -2229,7 +2420,7 @@
     </w:p>
     <w:tbl>
       <w:tblPr>
-        <w:tblStyle w:val="TableGrid"/>
+        <w:tblStyle w:val="Tablaconcuadrcula"/>
         <w:tblW w:w="10062" w:type="dxa"/>
         <w:tblInd w:w="-714" w:type="dxa"/>
         <w:tblBorders>
@@ -2259,7 +2450,7 @@
           </w:tcPr>
           <w:p>
             <w:pPr>
-              <w:pStyle w:val="Footer"/>
+              <w:pStyle w:val="Piedepgina"/>
               <w:jc w:val="center"/>
               <w:rPr>
                 <w:rFonts w:ascii="Calibri" w:hAnsi="Calibri"/>
@@ -2278,7 +2469,7 @@
           </w:p>
           <w:p>
             <w:pPr>
-              <w:pStyle w:val="Footer"/>
+              <w:pStyle w:val="Piedepgina"/>
               <w:jc w:val="center"/>
               <w:rPr>
                 <w:rFonts w:ascii="Calibri" w:hAnsi="Calibri"/>
@@ -2303,7 +2494,7 @@
           </w:tcPr>
           <w:p>
             <w:pPr>
-              <w:pStyle w:val="Footer"/>
+              <w:pStyle w:val="Piedepgina"/>
               <w:jc w:val="center"/>
               <w:rPr>
                 <w:rFonts w:ascii="Calibri" w:hAnsi="Calibri"/>
@@ -2328,7 +2519,7 @@
           </w:tcPr>
           <w:p>
             <w:pPr>
-              <w:pStyle w:val="Footer"/>
+              <w:pStyle w:val="Piedepgina"/>
               <w:jc w:val="center"/>
               <w:rPr>
                 <w:rFonts w:ascii="Calibri" w:hAnsi="Calibri"/>
@@ -2353,7 +2544,7 @@
           </w:tcPr>
           <w:p>
             <w:pPr>
-              <w:pStyle w:val="Footer"/>
+              <w:pStyle w:val="Piedepgina"/>
               <w:jc w:val="center"/>
               <w:rPr>
                 <w:rFonts w:ascii="Calibri" w:hAnsi="Calibri"/>
@@ -2423,7 +2614,23 @@
                 <w:rFonts w:ascii="Calibri" w:hAnsi="Calibri"/>
                 <w:sz w:val="18"/>
               </w:rPr>
-              <w:t>Problema, contexto, alcance, equipo y objetivos de AloApp.</w:t>
+              <w:t xml:space="preserve">Problema, contexto, alcance, equipo y objetivos de </w:t>
+            </w:r>
+            <w:proofErr w:type="spellStart"/>
+            <w:r>
+              <w:rPr>
+                <w:rFonts w:ascii="Calibri" w:hAnsi="Calibri"/>
+                <w:sz w:val="18"/>
+              </w:rPr>
+              <w:t>AloApp</w:t>
+            </w:r>
+            <w:proofErr w:type="spellEnd"/>
+            <w:r>
+              <w:rPr>
+                <w:rFonts w:ascii="Calibri" w:hAnsi="Calibri"/>
+                <w:sz w:val="18"/>
+              </w:rPr>
+              <w:t>.</w:t>
             </w:r>
           </w:p>
         </w:tc>
@@ -2642,7 +2849,55 @@
                 <w:rFonts w:ascii="Calibri" w:hAnsi="Calibri"/>
                 <w:sz w:val="18"/>
               </w:rPr>
-              <w:t>Descripción de las capas Presentation, BLoC, Repository, Service y la fuente de datos.</w:t>
+              <w:t xml:space="preserve">Descripción de las capas </w:t>
+            </w:r>
+            <w:proofErr w:type="spellStart"/>
+            <w:r>
+              <w:rPr>
+                <w:rFonts w:ascii="Calibri" w:hAnsi="Calibri"/>
+                <w:sz w:val="18"/>
+              </w:rPr>
+              <w:t>Presentation</w:t>
+            </w:r>
+            <w:proofErr w:type="spellEnd"/>
+            <w:r>
+              <w:rPr>
+                <w:rFonts w:ascii="Calibri" w:hAnsi="Calibri"/>
+                <w:sz w:val="18"/>
+              </w:rPr>
+              <w:t xml:space="preserve">, </w:t>
+            </w:r>
+            <w:proofErr w:type="spellStart"/>
+            <w:r>
+              <w:rPr>
+                <w:rFonts w:ascii="Calibri" w:hAnsi="Calibri"/>
+                <w:sz w:val="18"/>
+              </w:rPr>
+              <w:t>BLoC</w:t>
+            </w:r>
+            <w:proofErr w:type="spellEnd"/>
+            <w:r>
+              <w:rPr>
+                <w:rFonts w:ascii="Calibri" w:hAnsi="Calibri"/>
+                <w:sz w:val="18"/>
+              </w:rPr>
+              <w:t xml:space="preserve">, </w:t>
+            </w:r>
+            <w:proofErr w:type="spellStart"/>
+            <w:r>
+              <w:rPr>
+                <w:rFonts w:ascii="Calibri" w:hAnsi="Calibri"/>
+                <w:sz w:val="18"/>
+              </w:rPr>
+              <w:t>Repository</w:t>
+            </w:r>
+            <w:proofErr w:type="spellEnd"/>
+            <w:r>
+              <w:rPr>
+                <w:rFonts w:ascii="Calibri" w:hAnsi="Calibri"/>
+                <w:sz w:val="18"/>
+              </w:rPr>
+              <w:t>, Service y la fuente de datos.</w:t>
             </w:r>
           </w:p>
         </w:tc>
@@ -3039,7 +3294,7 @@
     </w:p>
     <w:tbl>
       <w:tblPr>
-        <w:tblStyle w:val="TableGrid"/>
+        <w:tblStyle w:val="Tablaconcuadrcula"/>
         <w:tblW w:w="9640" w:type="dxa"/>
         <w:tblInd w:w="-714" w:type="dxa"/>
         <w:tblBorders>
@@ -3116,7 +3371,7 @@
           </w:tcPr>
           <w:p>
             <w:pPr>
-              <w:pStyle w:val="Footer"/>
+              <w:pStyle w:val="Piedepgina"/>
               <w:jc w:val="both"/>
               <w:rPr>
                 <w:rFonts w:ascii="Calibri" w:hAnsi="Calibri"/>
@@ -3135,7 +3390,23 @@
                 <w:rFonts w:ascii="Calibri" w:hAnsi="Calibri"/>
                 <w:color w:val="1F3864" w:themeColor="accent1" w:themeShade="80"/>
               </w:rPr>
-              <w:t>efine la planificación de tu Proyecto APT de acuerdo a lo requerido</w:t>
+              <w:t xml:space="preserve">efine la planificación de tu Proyecto APT </w:t>
+            </w:r>
+            <w:proofErr w:type="gramStart"/>
+            <w:r>
+              <w:rPr>
+                <w:rFonts w:ascii="Calibri" w:hAnsi="Calibri"/>
+                <w:color w:val="1F3864" w:themeColor="accent1" w:themeShade="80"/>
+              </w:rPr>
+              <w:t>de acuerdo a</w:t>
+            </w:r>
+            <w:proofErr w:type="gramEnd"/>
+            <w:r>
+              <w:rPr>
+                <w:rFonts w:ascii="Calibri" w:hAnsi="Calibri"/>
+                <w:color w:val="1F3864" w:themeColor="accent1" w:themeShade="80"/>
+              </w:rPr>
+              <w:t xml:space="preserve"> lo requerido</w:t>
             </w:r>
             <w:r>
               <w:rPr>
@@ -3161,7 +3432,7 @@
     </w:p>
     <w:tbl>
       <w:tblPr>
-        <w:tblStyle w:val="TableGrid"/>
+        <w:tblStyle w:val="Tablaconcuadrcula"/>
         <w:tblW w:w="11061" w:type="dxa"/>
         <w:jc w:val="center"/>
         <w:tblBorders>
@@ -3273,14 +3544,30 @@
                 <w:rFonts w:ascii="Calibri" w:hAnsi="Calibri"/>
                 <w:color w:val="1F3864" w:themeColor="accent1" w:themeShade="80"/>
               </w:rPr>
-              <w:t xml:space="preserve">Nombre de </w:t>
-            </w:r>
-            <w:r>
-              <w:rPr>
-                <w:rFonts w:ascii="Calibri" w:hAnsi="Calibri"/>
-                <w:color w:val="1F3864" w:themeColor="accent1" w:themeShade="80"/>
-              </w:rPr>
-              <w:t xml:space="preserve"> Actividades/Tareas</w:t>
+              <w:t xml:space="preserve">Nombre </w:t>
+            </w:r>
+            <w:proofErr w:type="gramStart"/>
+            <w:r>
+              <w:rPr>
+                <w:rFonts w:ascii="Calibri" w:hAnsi="Calibri"/>
+                <w:color w:val="1F3864" w:themeColor="accent1" w:themeShade="80"/>
+              </w:rPr>
+              <w:t xml:space="preserve">de </w:t>
+            </w:r>
+            <w:r>
+              <w:rPr>
+                <w:rFonts w:ascii="Calibri" w:hAnsi="Calibri"/>
+                <w:color w:val="1F3864" w:themeColor="accent1" w:themeShade="80"/>
+              </w:rPr>
+              <w:t xml:space="preserve"> Actividades</w:t>
+            </w:r>
+            <w:proofErr w:type="gramEnd"/>
+            <w:r>
+              <w:rPr>
+                <w:rFonts w:ascii="Calibri" w:hAnsi="Calibri"/>
+                <w:color w:val="1F3864" w:themeColor="accent1" w:themeShade="80"/>
+              </w:rPr>
+              <w:t>/Tareas</w:t>
             </w:r>
           </w:p>
         </w:tc>
@@ -3388,7 +3675,7 @@
             </w:r>
             <w:r>
               <w:rPr>
-                <w:rStyle w:val="FootnoteReference"/>
+                <w:rStyle w:val="Refdenotaalpie"/>
                 <w:rFonts w:ascii="Calibri" w:hAnsi="Calibri"/>
                 <w:color w:val="1F3864" w:themeColor="accent1" w:themeShade="80"/>
               </w:rPr>
@@ -3875,12 +4162,21 @@
             <w:pPr>
               <w:spacing w:before="20" w:after="20"/>
             </w:pPr>
-            <w:r>
-              <w:rPr>
-                <w:rFonts w:ascii="Calibri" w:hAnsi="Calibri"/>
-                <w:sz w:val="16"/>
-              </w:rPr>
-              <w:t>Flutter, Dart y documentación técnica.</w:t>
+            <w:proofErr w:type="spellStart"/>
+            <w:r>
+              <w:rPr>
+                <w:rFonts w:ascii="Calibri" w:hAnsi="Calibri"/>
+                <w:sz w:val="16"/>
+              </w:rPr>
+              <w:t>Flutter</w:t>
+            </w:r>
+            <w:proofErr w:type="spellEnd"/>
+            <w:r>
+              <w:rPr>
+                <w:rFonts w:ascii="Calibri" w:hAnsi="Calibri"/>
+                <w:sz w:val="16"/>
+              </w:rPr>
+              <w:t>, Dart y documentación técnica.</w:t>
             </w:r>
           </w:p>
         </w:tc>
@@ -3999,12 +4295,21 @@
             <w:pPr>
               <w:spacing w:before="20" w:after="20"/>
             </w:pPr>
-            <w:r>
-              <w:rPr>
-                <w:rFonts w:ascii="Calibri" w:hAnsi="Calibri"/>
-                <w:sz w:val="16"/>
-              </w:rPr>
-              <w:t>Flutter, fuente de datos y entorno de pruebas.</w:t>
+            <w:proofErr w:type="spellStart"/>
+            <w:r>
+              <w:rPr>
+                <w:rFonts w:ascii="Calibri" w:hAnsi="Calibri"/>
+                <w:sz w:val="16"/>
+              </w:rPr>
+              <w:t>Flutter</w:t>
+            </w:r>
+            <w:proofErr w:type="spellEnd"/>
+            <w:r>
+              <w:rPr>
+                <w:rFonts w:ascii="Calibri" w:hAnsi="Calibri"/>
+                <w:sz w:val="16"/>
+              </w:rPr>
+              <w:t>, fuente de datos y entorno de pruebas.</w:t>
             </w:r>
           </w:p>
         </w:tc>
@@ -4123,12 +4428,21 @@
             <w:pPr>
               <w:spacing w:before="20" w:after="20"/>
             </w:pPr>
-            <w:r>
-              <w:rPr>
-                <w:rFonts w:ascii="Calibri" w:hAnsi="Calibri"/>
-                <w:sz w:val="16"/>
-              </w:rPr>
-              <w:t>Flutter, base de datos o servicio autorizado.</w:t>
+            <w:proofErr w:type="spellStart"/>
+            <w:r>
+              <w:rPr>
+                <w:rFonts w:ascii="Calibri" w:hAnsi="Calibri"/>
+                <w:sz w:val="16"/>
+              </w:rPr>
+              <w:t>Flutter</w:t>
+            </w:r>
+            <w:proofErr w:type="spellEnd"/>
+            <w:r>
+              <w:rPr>
+                <w:rFonts w:ascii="Calibri" w:hAnsi="Calibri"/>
+                <w:sz w:val="16"/>
+              </w:rPr>
+              <w:t>, base de datos o servicio autorizado.</w:t>
             </w:r>
           </w:p>
         </w:tc>
@@ -4490,7 +4804,7 @@
     </w:p>
     <w:tbl>
       <w:tblPr>
-        <w:tblStyle w:val="TableGrid"/>
+        <w:tblStyle w:val="Tablaconcuadrcula"/>
         <w:tblW w:w="9640" w:type="dxa"/>
         <w:tblInd w:w="-714" w:type="dxa"/>
         <w:tblBorders>
@@ -4569,7 +4883,7 @@
     </w:p>
     <w:tbl>
       <w:tblPr>
-        <w:tblStyle w:val="TableGrid"/>
+        <w:tblStyle w:val="Tablaconcuadrcula"/>
         <w:tblW w:w="10802" w:type="dxa"/>
         <w:tblInd w:w="-1160" w:type="dxa"/>
         <w:tblBorders>
@@ -7975,6 +8289,7 @@
         </w:tc>
       </w:tr>
     </w:tbl>
+    <w:p/>
     <w:p/>
     <w:sectPr>
       <w:headerReference w:type="default" r:id="rId10"/>
@@ -8037,7 +8352,7 @@
   <w:footnote w:id="1">
     <w:p>
       <w:pPr>
-        <w:pStyle w:val="FootnoteText"/>
+        <w:pStyle w:val="Textonotapie"/>
         <w:rPr>
           <w:color w:val="595959" w:themeColor="text1" w:themeTint="A6"/>
           <w:lang w:val="es-CL"/>
@@ -8227,7 +8542,7 @@
   </w:tbl>
   <w:p>
     <w:pPr>
-      <w:pStyle w:val="Header"/>
+      <w:pStyle w:val="Encabezado"/>
     </w:pPr>
   </w:p>
 </w:hdr>
@@ -9041,11 +9356,11 @@
       <w:szCs w:val="22"/>
     </w:rPr>
   </w:style>
-  <w:style w:type="paragraph" w:styleId="Heading3">
+  <w:style w:type="paragraph" w:styleId="Ttulo3">
     <w:name w:val="heading 3"/>
     <w:basedOn w:val="Normal"/>
     <w:next w:val="Normal"/>
-    <w:link w:val="Heading3Char"/>
+    <w:link w:val="Ttulo3Car"/>
     <w:uiPriority w:val="9"/>
     <w:unhideWhenUsed/>
     <w:qFormat/>
@@ -9063,13 +9378,13 @@
       <w:szCs w:val="24"/>
     </w:rPr>
   </w:style>
-  <w:style w:type="character" w:default="1" w:styleId="DefaultParagraphFont">
+  <w:style w:type="character" w:default="1" w:styleId="Fuentedeprrafopredeter">
     <w:name w:val="Default Paragraph Font"/>
     <w:uiPriority w:val="1"/>
     <w:semiHidden/>
     <w:unhideWhenUsed/>
   </w:style>
-  <w:style w:type="table" w:default="1" w:styleId="TableNormal">
+  <w:style w:type="table" w:default="1" w:styleId="Tablanormal">
     <w:name w:val="Normal Table"/>
     <w:uiPriority w:val="99"/>
     <w:semiHidden/>
@@ -9084,16 +9399,16 @@
       </w:tblCellMar>
     </w:tblPr>
   </w:style>
-  <w:style w:type="numbering" w:default="1" w:styleId="NoList">
+  <w:style w:type="numbering" w:default="1" w:styleId="Sinlista">
     <w:name w:val="No List"/>
     <w:uiPriority w:val="99"/>
     <w:semiHidden/>
     <w:unhideWhenUsed/>
   </w:style>
-  <w:style w:type="character" w:customStyle="1" w:styleId="Heading3Char">
-    <w:name w:val="Heading 3 Char"/>
-    <w:basedOn w:val="DefaultParagraphFont"/>
-    <w:link w:val="Heading3"/>
+  <w:style w:type="character" w:customStyle="1" w:styleId="Ttulo3Car">
+    <w:name w:val="Título 3 Car"/>
+    <w:basedOn w:val="Fuentedeprrafopredeter"/>
+    <w:link w:val="Ttulo3"/>
     <w:uiPriority w:val="9"/>
     <w:rsid w:val="00D110EC"/>
     <w:rPr>
@@ -9101,9 +9416,9 @@
       <w:color w:val="1F3763" w:themeColor="accent1" w:themeShade="7F"/>
     </w:rPr>
   </w:style>
-  <w:style w:type="table" w:styleId="TableGrid">
+  <w:style w:type="table" w:styleId="Tablaconcuadrcula">
     <w:name w:val="Table Grid"/>
-    <w:basedOn w:val="TableNormal"/>
+    <w:basedOn w:val="Tablanormal"/>
     <w:uiPriority w:val="39"/>
     <w:rsid w:val="00D110EC"/>
     <w:rPr>
@@ -9121,10 +9436,10 @@
       </w:tblBorders>
     </w:tblPr>
   </w:style>
-  <w:style w:type="paragraph" w:styleId="Footer">
+  <w:style w:type="paragraph" w:styleId="Piedepgina">
     <w:name w:val="footer"/>
     <w:basedOn w:val="Normal"/>
-    <w:link w:val="FooterChar"/>
+    <w:link w:val="PiedepginaCar"/>
     <w:uiPriority w:val="99"/>
     <w:unhideWhenUsed/>
     <w:rsid w:val="00D110EC"/>
@@ -9136,10 +9451,10 @@
       <w:spacing w:after="0" w:line="240" w:lineRule="auto"/>
     </w:pPr>
   </w:style>
-  <w:style w:type="character" w:customStyle="1" w:styleId="FooterChar">
-    <w:name w:val="Footer Char"/>
-    <w:basedOn w:val="DefaultParagraphFont"/>
-    <w:link w:val="Footer"/>
+  <w:style w:type="character" w:customStyle="1" w:styleId="PiedepginaCar">
+    <w:name w:val="Pie de página Car"/>
+    <w:basedOn w:val="Fuentedeprrafopredeter"/>
+    <w:link w:val="Piedepgina"/>
     <w:uiPriority w:val="99"/>
     <w:rsid w:val="00D110EC"/>
     <w:rPr>
@@ -9147,10 +9462,10 @@
       <w:szCs w:val="22"/>
     </w:rPr>
   </w:style>
-  <w:style w:type="paragraph" w:styleId="ListParagraph">
+  <w:style w:type="paragraph" w:styleId="Prrafodelista">
     <w:name w:val="List Paragraph"/>
     <w:basedOn w:val="Normal"/>
-    <w:link w:val="ListParagraphChar"/>
+    <w:link w:val="PrrafodelistaCar"/>
     <w:uiPriority w:val="34"/>
     <w:qFormat/>
     <w:rsid w:val="00D110EC"/>
@@ -9159,9 +9474,9 @@
       <w:contextualSpacing/>
     </w:pPr>
   </w:style>
-  <w:style w:type="character" w:customStyle="1" w:styleId="ListParagraphChar">
-    <w:name w:val="List Paragraph Char"/>
-    <w:link w:val="ListParagraph"/>
+  <w:style w:type="character" w:customStyle="1" w:styleId="PrrafodelistaCar">
+    <w:name w:val="Párrafo de lista Car"/>
+    <w:link w:val="Prrafodelista"/>
     <w:uiPriority w:val="34"/>
     <w:rsid w:val="00D110EC"/>
     <w:rPr>
@@ -9169,10 +9484,10 @@
       <w:szCs w:val="22"/>
     </w:rPr>
   </w:style>
-  <w:style w:type="paragraph" w:styleId="FootnoteText">
+  <w:style w:type="paragraph" w:styleId="Textonotapie">
     <w:name w:val="footnote text"/>
     <w:basedOn w:val="Normal"/>
-    <w:link w:val="FootnoteTextChar"/>
+    <w:link w:val="TextonotapieCar"/>
     <w:uiPriority w:val="99"/>
     <w:semiHidden/>
     <w:unhideWhenUsed/>
@@ -9186,10 +9501,10 @@
       <w:lang w:val="es-ES"/>
     </w:rPr>
   </w:style>
-  <w:style w:type="character" w:customStyle="1" w:styleId="FootnoteTextChar">
-    <w:name w:val="Footnote Text Char"/>
-    <w:basedOn w:val="DefaultParagraphFont"/>
-    <w:link w:val="FootnoteText"/>
+  <w:style w:type="character" w:customStyle="1" w:styleId="TextonotapieCar">
+    <w:name w:val="Texto nota pie Car"/>
+    <w:basedOn w:val="Fuentedeprrafopredeter"/>
+    <w:link w:val="Textonotapie"/>
     <w:uiPriority w:val="99"/>
     <w:semiHidden/>
     <w:rsid w:val="00D110EC"/>
@@ -9199,19 +9514,19 @@
       <w:lang w:val="es-ES"/>
     </w:rPr>
   </w:style>
-  <w:style w:type="character" w:styleId="FootnoteReference">
+  <w:style w:type="character" w:styleId="Refdenotaalpie">
     <w:name w:val="footnote reference"/>
-    <w:basedOn w:val="DefaultParagraphFont"/>
+    <w:basedOn w:val="Fuentedeprrafopredeter"/>
     <w:unhideWhenUsed/>
     <w:rsid w:val="00D110EC"/>
     <w:rPr>
       <w:vertAlign w:val="superscript"/>
     </w:rPr>
   </w:style>
-  <w:style w:type="paragraph" w:styleId="Header">
+  <w:style w:type="paragraph" w:styleId="Encabezado">
     <w:name w:val="header"/>
     <w:basedOn w:val="Normal"/>
-    <w:link w:val="HeaderChar"/>
+    <w:link w:val="EncabezadoCar"/>
     <w:uiPriority w:val="99"/>
     <w:unhideWhenUsed/>
     <w:rsid w:val="00565AE6"/>
@@ -9223,10 +9538,10 @@
       <w:spacing w:after="0" w:line="240" w:lineRule="auto"/>
     </w:pPr>
   </w:style>
-  <w:style w:type="character" w:customStyle="1" w:styleId="HeaderChar">
-    <w:name w:val="Header Char"/>
-    <w:basedOn w:val="DefaultParagraphFont"/>
-    <w:link w:val="Header"/>
+  <w:style w:type="character" w:customStyle="1" w:styleId="EncabezadoCar">
+    <w:name w:val="Encabezado Car"/>
+    <w:basedOn w:val="Fuentedeprrafopredeter"/>
+    <w:link w:val="Encabezado"/>
     <w:uiPriority w:val="99"/>
     <w:rsid w:val="00565AE6"/>
     <w:rPr>
@@ -9236,8 +9551,8 @@
   </w:style>
   <w:style w:type="table" w:customStyle="1" w:styleId="Tablaconcuadrcula1">
     <w:name w:val="Tabla con cuadrícula1"/>
-    <w:basedOn w:val="TableNormal"/>
-    <w:next w:val="TableGrid"/>
+    <w:basedOn w:val="Tablanormal"/>
+    <w:next w:val="Tablaconcuadrcula"/>
     <w:uiPriority w:val="39"/>
     <w:rsid w:val="005673ED"/>
     <w:rPr>
@@ -9255,10 +9570,10 @@
       </w:tblBorders>
     </w:tblPr>
   </w:style>
-  <w:style w:type="paragraph" w:styleId="BalloonText">
+  <w:style w:type="paragraph" w:styleId="Textodeglobo">
     <w:name w:val="Balloon Text"/>
     <w:basedOn w:val="Normal"/>
-    <w:link w:val="BalloonTextChar"/>
+    <w:link w:val="TextodegloboCar"/>
     <w:uiPriority w:val="99"/>
     <w:semiHidden/>
     <w:unhideWhenUsed/>
@@ -9272,10 +9587,10 @@
       <w:szCs w:val="18"/>
     </w:rPr>
   </w:style>
-  <w:style w:type="character" w:customStyle="1" w:styleId="BalloonTextChar">
-    <w:name w:val="Balloon Text Char"/>
-    <w:basedOn w:val="DefaultParagraphFont"/>
-    <w:link w:val="BalloonText"/>
+  <w:style w:type="character" w:customStyle="1" w:styleId="TextodegloboCar">
+    <w:name w:val="Texto de globo Car"/>
+    <w:basedOn w:val="Fuentedeprrafopredeter"/>
+    <w:link w:val="Textodeglobo"/>
     <w:uiPriority w:val="99"/>
     <w:semiHidden/>
     <w:rsid w:val="00E65208"/>
@@ -9285,9 +9600,9 @@
       <w:szCs w:val="18"/>
     </w:rPr>
   </w:style>
-  <w:style w:type="character" w:styleId="CommentReference">
+  <w:style w:type="character" w:styleId="Refdecomentario">
     <w:name w:val="annotation reference"/>
-    <w:basedOn w:val="DefaultParagraphFont"/>
+    <w:basedOn w:val="Fuentedeprrafopredeter"/>
     <w:uiPriority w:val="99"/>
     <w:semiHidden/>
     <w:unhideWhenUsed/>
@@ -9297,10 +9612,10 @@
       <w:szCs w:val="16"/>
     </w:rPr>
   </w:style>
-  <w:style w:type="paragraph" w:styleId="CommentText">
+  <w:style w:type="paragraph" w:styleId="Textocomentario">
     <w:name w:val="annotation text"/>
     <w:basedOn w:val="Normal"/>
-    <w:link w:val="CommentTextChar"/>
+    <w:link w:val="TextocomentarioCar"/>
     <w:uiPriority w:val="99"/>
     <w:unhideWhenUsed/>
     <w:rsid w:val="008018E6"/>
@@ -9312,10 +9627,10 @@
       <w:szCs w:val="20"/>
     </w:rPr>
   </w:style>
-  <w:style w:type="character" w:customStyle="1" w:styleId="CommentTextChar">
-    <w:name w:val="Comment Text Char"/>
-    <w:basedOn w:val="DefaultParagraphFont"/>
-    <w:link w:val="CommentText"/>
+  <w:style w:type="character" w:customStyle="1" w:styleId="TextocomentarioCar">
+    <w:name w:val="Texto comentario Car"/>
+    <w:basedOn w:val="Fuentedeprrafopredeter"/>
+    <w:link w:val="Textocomentario"/>
     <w:uiPriority w:val="99"/>
     <w:rsid w:val="008018E6"/>
     <w:rPr>
@@ -9323,11 +9638,11 @@
       <w:szCs w:val="20"/>
     </w:rPr>
   </w:style>
-  <w:style w:type="paragraph" w:styleId="CommentSubject">
+  <w:style w:type="paragraph" w:styleId="Asuntodelcomentario">
     <w:name w:val="annotation subject"/>
-    <w:basedOn w:val="CommentText"/>
-    <w:next w:val="CommentText"/>
-    <w:link w:val="CommentSubjectChar"/>
+    <w:basedOn w:val="Textocomentario"/>
+    <w:next w:val="Textocomentario"/>
+    <w:link w:val="AsuntodelcomentarioCar"/>
     <w:uiPriority w:val="99"/>
     <w:semiHidden/>
     <w:unhideWhenUsed/>
@@ -9337,10 +9652,10 @@
       <w:bCs/>
     </w:rPr>
   </w:style>
-  <w:style w:type="character" w:customStyle="1" w:styleId="CommentSubjectChar">
-    <w:name w:val="Comment Subject Char"/>
-    <w:basedOn w:val="CommentTextChar"/>
-    <w:link w:val="CommentSubject"/>
+  <w:style w:type="character" w:customStyle="1" w:styleId="AsuntodelcomentarioCar">
+    <w:name w:val="Asunto del comentario Car"/>
+    <w:basedOn w:val="TextocomentarioCar"/>
+    <w:link w:val="Asuntodelcomentario"/>
     <w:uiPriority w:val="99"/>
     <w:semiHidden/>
     <w:rsid w:val="008018E6"/>
@@ -9650,9 +9965,12 @@
 </file>
 
 <file path=customXml/item1.xml><?xml version="1.0" encoding="utf-8"?>
-<p:properties xmlns:p="http://schemas.microsoft.com/office/2006/metadata/properties" xmlns:xsi="http://www.w3.org/2001/XMLSchema-instance" xmlns:pc="http://schemas.microsoft.com/office/infopath/2007/PartnerControls">
-  <documentManagement/>
-</p:properties>
+<?mso-contentType ?>
+<FormTemplates xmlns="http://schemas.microsoft.com/sharepoint/v3/contenttype/forms">
+  <Display>DocumentLibraryForm</Display>
+  <Edit>DocumentLibraryForm</Edit>
+  <New>DocumentLibraryForm</New>
+</FormTemplates>
 </file>
 
 <file path=customXml/item2.xml><?xml version="1.0" encoding="utf-8"?>
@@ -9788,19 +10106,15 @@
 </file>
 
 <file path=customXml/item3.xml><?xml version="1.0" encoding="utf-8"?>
-<?mso-contentType ?>
-<FormTemplates xmlns="http://schemas.microsoft.com/sharepoint/v3/contenttype/forms">
-  <Display>DocumentLibraryForm</Display>
-  <Edit>DocumentLibraryForm</Edit>
-  <New>DocumentLibraryForm</New>
-</FormTemplates>
+<p:properties xmlns:p="http://schemas.microsoft.com/office/2006/metadata/properties" xmlns:xsi="http://www.w3.org/2001/XMLSchema-instance" xmlns:pc="http://schemas.microsoft.com/office/infopath/2007/PartnerControls">
+  <documentManagement/>
+</p:properties>
 </file>
 
 <file path=customXml/itemProps1.xml><?xml version="1.0" encoding="utf-8"?>
-<ds:datastoreItem xmlns:ds="http://schemas.openxmlformats.org/officeDocument/2006/customXml" ds:itemID="{38174882-579A-45DC-A704-C035A9357F73}">
+<ds:datastoreItem xmlns:ds="http://schemas.openxmlformats.org/officeDocument/2006/customXml" ds:itemID="{F3E3E2F7-59E7-4722-B872-D023DC9D1CC1}">
   <ds:schemaRefs>
-    <ds:schemaRef ds:uri="http://schemas.microsoft.com/office/2006/metadata/properties"/>
-    <ds:schemaRef ds:uri="http://schemas.microsoft.com/office/infopath/2007/PartnerControls"/>
+    <ds:schemaRef ds:uri="http://schemas.microsoft.com/sharepoint/v3/contenttype/forms"/>
   </ds:schemaRefs>
 </ds:datastoreItem>
 </file>
@@ -9824,9 +10138,10 @@
 </file>
 
 <file path=customXml/itemProps3.xml><?xml version="1.0" encoding="utf-8"?>
-<ds:datastoreItem xmlns:ds="http://schemas.openxmlformats.org/officeDocument/2006/customXml" ds:itemID="{F3E3E2F7-59E7-4722-B872-D023DC9D1CC1}">
+<ds:datastoreItem xmlns:ds="http://schemas.openxmlformats.org/officeDocument/2006/customXml" ds:itemID="{38174882-579A-45DC-A704-C035A9357F73}">
   <ds:schemaRefs>
-    <ds:schemaRef ds:uri="http://schemas.microsoft.com/sharepoint/v3/contenttype/forms"/>
+    <ds:schemaRef ds:uri="http://schemas.microsoft.com/office/2006/metadata/properties"/>
+    <ds:schemaRef ds:uri="http://schemas.microsoft.com/office/infopath/2007/PartnerControls"/>
   </ds:schemaRefs>
 </ds:datastoreItem>
 </file>
</xml_diff>